<commit_message>
chore: limpia .gitignore y UserList; actualiza la memoria del TFG
</commit_message>
<xml_diff>
--- a/doc/Documentacion_Tfg.docx
+++ b/doc/Documentacion_Tfg.docx
@@ -4244,158 +4244,24 @@
           <w:lang w:val="es-ES"/>
         </w:rPr>
       </w:pPr>
-      <w:proofErr w:type="spellStart"/>
-      <w:r>
-        <w:rPr>
-          <w:lang w:val="es-ES"/>
-        </w:rPr>
-        <w:t>PayFlow</w:t>
-      </w:r>
-      <w:proofErr w:type="spellEnd"/>
-      <w:r>
-        <w:rPr>
-          <w:lang w:val="es-ES"/>
-        </w:rPr>
-        <w:t xml:space="preserve"> es una aplicación web de gestión de finanzas personales orientada al usuario final. Permite llevar un seguimiento de ingresos y gastos, gestionar una cartera digital con transferencias entre usuarios (P2P), conectar cuentas bancarias reales mediante Open </w:t>
-      </w:r>
-      <w:proofErr w:type="spellStart"/>
-      <w:r>
-        <w:rPr>
-          <w:lang w:val="es-ES"/>
-        </w:rPr>
-        <w:t>Banking</w:t>
-      </w:r>
-      <w:proofErr w:type="spellEnd"/>
-      <w:r>
-        <w:rPr>
-          <w:lang w:val="es-ES"/>
-        </w:rPr>
-        <w:t xml:space="preserve"> (PSD2) a través de la API de </w:t>
-      </w:r>
-      <w:proofErr w:type="spellStart"/>
-      <w:r>
-        <w:rPr>
-          <w:lang w:val="es-ES"/>
-        </w:rPr>
-        <w:t>Nordigen</w:t>
-      </w:r>
-      <w:proofErr w:type="spellEnd"/>
-      <w:r>
-        <w:rPr>
-          <w:lang w:val="es-ES"/>
-        </w:rPr>
-        <w:t>/</w:t>
-      </w:r>
-      <w:proofErr w:type="spellStart"/>
-      <w:r>
-        <w:rPr>
-          <w:lang w:val="es-ES"/>
-        </w:rPr>
-        <w:t>GoCardless</w:t>
-      </w:r>
-      <w:proofErr w:type="spellEnd"/>
-      <w:r>
-        <w:rPr>
-          <w:lang w:val="es-ES"/>
-        </w:rPr>
-        <w:t>, y emitir facturas y resúmenes fiscales trimestrales para trabajadores autónomos. Incluye además la contratación de un plan de pago («Autónomos») mediante la pasarela Stripe, un panel de administración de usuarios y roles, y la recuperación de contraseña por correo electrónico.</w:t>
-      </w:r>
-    </w:p>
-    <w:p>
-      <w:pPr>
-        <w:rPr>
-          <w:lang w:val="es-ES"/>
-        </w:rPr>
-      </w:pPr>
-      <w:r>
-        <w:rPr>
-          <w:lang w:val="es-ES"/>
-        </w:rPr>
-        <w:t xml:space="preserve">El </w:t>
-      </w:r>
-      <w:proofErr w:type="spellStart"/>
-      <w:r>
-        <w:rPr>
-          <w:lang w:val="es-ES"/>
-        </w:rPr>
-        <w:t>backend</w:t>
-      </w:r>
-      <w:proofErr w:type="spellEnd"/>
-      <w:r>
-        <w:rPr>
-          <w:lang w:val="es-ES"/>
-        </w:rPr>
-        <w:t xml:space="preserve"> sigue una arquitectura de microservicios con Spring Boot 3 y Spring Cloud, y el </w:t>
-      </w:r>
-      <w:proofErr w:type="spellStart"/>
-      <w:r>
-        <w:rPr>
-          <w:lang w:val="es-ES"/>
-        </w:rPr>
-        <w:t>frontend</w:t>
-      </w:r>
-      <w:proofErr w:type="spellEnd"/>
-      <w:r>
-        <w:rPr>
-          <w:lang w:val="es-ES"/>
-        </w:rPr>
-        <w:t xml:space="preserve"> es una SPA (</w:t>
-      </w:r>
-      <w:proofErr w:type="gramStart"/>
-      <w:r>
-        <w:rPr>
-          <w:lang w:val="es-ES"/>
-        </w:rPr>
-        <w:t>Single</w:t>
-      </w:r>
-      <w:proofErr w:type="gramEnd"/>
-      <w:r>
-        <w:rPr>
-          <w:lang w:val="es-ES"/>
-        </w:rPr>
-        <w:t xml:space="preserve"> Page </w:t>
-      </w:r>
-      <w:proofErr w:type="spellStart"/>
-      <w:r>
-        <w:rPr>
-          <w:lang w:val="es-ES"/>
-        </w:rPr>
-        <w:t>Application</w:t>
-      </w:r>
-      <w:proofErr w:type="spellEnd"/>
-      <w:r>
-        <w:rPr>
-          <w:lang w:val="es-ES"/>
-        </w:rPr>
-        <w:t xml:space="preserve">) desarrollada con </w:t>
-      </w:r>
-      <w:proofErr w:type="spellStart"/>
-      <w:r>
-        <w:rPr>
-          <w:lang w:val="es-ES"/>
-        </w:rPr>
-        <w:t>React</w:t>
-      </w:r>
-      <w:proofErr w:type="spellEnd"/>
-      <w:r>
-        <w:rPr>
-          <w:lang w:val="es-ES"/>
-        </w:rPr>
-        <w:t xml:space="preserve"> 19 y Vite. Toda la plataforma se orquesta con Docker </w:t>
-      </w:r>
-      <w:proofErr w:type="spellStart"/>
-      <w:r>
-        <w:rPr>
-          <w:lang w:val="es-ES"/>
-        </w:rPr>
-        <w:t>Compose</w:t>
-      </w:r>
-      <w:proofErr w:type="spellEnd"/>
-      <w:r>
-        <w:rPr>
-          <w:lang w:val="es-ES"/>
-        </w:rPr>
-        <w:t>.</w:t>
+      <w:r>
+        <w:rPr>
+          <w:lang w:val="es-ES"/>
+        </w:rPr>
+        <w:t xml:space="preserve">PayFlow es una aplicación web de finanzas personales que permite controlar ingresos y gastos, gestionar una cartera digital con transferencias entre usuarios (P2P), conectar cuentas bancarias reales mediante Open Banking (PSD2, vía Nordigen/GoCardless) y emitir facturas y liquidaciones fiscales trimestrales para autónomos. Incluye un plan de pago («Autónomos») mediante Stripe, un panel de administración de usuarios y roles, y recuperación de contraseña por correo.</w:t>
+      </w:r>
+    </w:p>
+    <w:p>
+      <w:pPr>
+        <w:rPr>
+          <w:lang w:val="es-ES"/>
+        </w:rPr>
+      </w:pPr>
+      <w:r>
+        <w:rPr>
+          <w:lang w:val="es-ES"/>
+        </w:rPr>
+        <w:t xml:space="preserve">El backend es una arquitectura de microservicios con Spring Boot 3 y Spring Cloud; el frontend, una SPA en React 19 y Vite. Todo el conjunto se orquesta con Docker Compose.</w:t>
       </w:r>
     </w:p>
     <w:p>
@@ -4424,55 +4290,7 @@
         <w:rPr>
           <w:lang w:val="es-ES"/>
         </w:rPr>
-        <w:t xml:space="preserve">Diseñar, implementar y desplegar una plataforma web de finanzas personales completa y funcional, aplicando los conocimientos del Ciclo Formativo de Grado Superior en DAW, con énfasis en arquitecturas modernas de software (microservicios), seguridad en aplicaciones web (JWT, roles) e integración con servicios externos reales (Open </w:t>
-      </w:r>
-      <w:proofErr w:type="spellStart"/>
-      <w:r>
-        <w:rPr>
-          <w:lang w:val="es-ES"/>
-        </w:rPr>
-        <w:t>Banking</w:t>
-      </w:r>
-      <w:proofErr w:type="spellEnd"/>
-      <w:r>
-        <w:rPr>
-          <w:lang w:val="es-ES"/>
-        </w:rPr>
-        <w:t xml:space="preserve"> y pagos con Stripe). </w:t>
-      </w:r>
-      <w:proofErr w:type="spellStart"/>
-      <w:r>
-        <w:rPr>
-          <w:lang w:val="es-ES"/>
-        </w:rPr>
-        <w:t>PayFlow</w:t>
-      </w:r>
-      <w:proofErr w:type="spellEnd"/>
-      <w:r>
-        <w:rPr>
-          <w:lang w:val="es-ES"/>
-        </w:rPr>
-        <w:t xml:space="preserve"> aspira a cubrir un nicho no atendido por las soluciones del mercado: combinar en una sola aplicación cartera P2P, Open </w:t>
-      </w:r>
-      <w:proofErr w:type="spellStart"/>
-      <w:r>
-        <w:rPr>
-          <w:lang w:val="es-ES"/>
-        </w:rPr>
-        <w:t>Banking</w:t>
-      </w:r>
-      <w:proofErr w:type="spellEnd"/>
-      <w:r>
-        <w:rPr>
-          <w:lang w:val="es-ES"/>
-        </w:rPr>
-        <w:t xml:space="preserve"> europeo y un módulo fiscal para autónomos, con un enfoque en la privacidad del usuario.</w:t>
-      </w:r>
-      <w:r>
-        <w:rPr>
-          <w:lang w:val="es-ES"/>
-        </w:rPr>
-        <w:br w:type="page"/>
+        <w:t xml:space="preserve">El objetivo es diseñar, implementar y desplegar una plataforma de finanzas personales completa y funcional, aplicando los conocimientos del ciclo de DAW con énfasis en microservicios, seguridad web (JWT y roles) e integración con servicios externos reales (Open Banking y Stripe). PayFlow cubre un nicho poco atendido: combinar cartera P2P, Open Banking europeo y módulo fiscal para autónomos en una sola aplicación centrada en la privacidad.</w:t>
       </w:r>
     </w:p>
     <w:p>
@@ -6281,21 +6099,7 @@
         <w:rPr>
           <w:lang w:val="es-ES"/>
         </w:rPr>
-        <w:t xml:space="preserve">Memoria RAM: 8 GB como mínimo; 16 GB recomendados, ya que se ejecutan simultáneamente siete procesos Java, la base de datos PostgreSQL y el servidor de desarrollo del </w:t>
-      </w:r>
-      <w:proofErr w:type="spellStart"/>
-      <w:r>
-        <w:rPr>
-          <w:lang w:val="es-ES"/>
-        </w:rPr>
-        <w:t>frontend</w:t>
-      </w:r>
-      <w:proofErr w:type="spellEnd"/>
-      <w:r>
-        <w:rPr>
-          <w:lang w:val="es-ES"/>
-        </w:rPr>
-        <w:t>.</w:t>
+        <w:t xml:space="preserve">RAM: 8 GB como mínimo (16 GB recomendados), al ejecutarse simultáneamente siete procesos Java, PostgreSQL y el servidor de desarrollo del frontend.</w:t>
       </w:r>
     </w:p>
     <w:p>
@@ -6992,14 +6796,12 @@
           <w:lang w:val="es-ES"/>
         </w:rPr>
       </w:pPr>
-      <w:bookmarkStart w:id="10" w:name="_Toc231290023"/>
-      <w:r>
-        <w:rPr>
-          <w:lang w:val="es-ES"/>
-        </w:rPr>
-        <w:t>La elección de microservicios no es arbitraria: responde a la naturaleza del dominio financiero, que agrupa funcionalidades con ciclos de vida, requisitos de seguridad y necesidades de escalado radicalmente distintos. A continuación, los argumentos clave.</w:t>
-      </w:r>
-      <w:bookmarkEnd w:id="10"/>
+      <w:r>
+        <w:rPr>
+          <w:lang w:val="es-ES"/>
+        </w:rPr>
+        <w:t xml:space="preserve">La elección de microservicios responde a la naturaleza del dominio financiero, que agrupa funcionalidades con ciclos de vida, seguridad y escalado muy distintos:</w:t>
+      </w:r>
     </w:p>
     <w:p>
       <w:pPr>
@@ -7008,42 +6810,19 @@
           <w:lang w:val="es-ES"/>
         </w:rPr>
       </w:pPr>
-      <w:bookmarkStart w:id="11" w:name="_Toc231290024"/>
-      <w:r>
-        <w:rPr>
-          <w:lang w:val="es-ES"/>
-        </w:rPr>
-        <w:t xml:space="preserve">Aislamiento de fallos y alta disponibilidad. En un monolito, un error en la lógica de facturas puede tumbar toda la aplicación. En </w:t>
-      </w:r>
-      <w:proofErr w:type="spellStart"/>
-      <w:r>
-        <w:rPr>
-          <w:lang w:val="es-ES"/>
-        </w:rPr>
-        <w:t>PayFlow</w:t>
-      </w:r>
-      <w:proofErr w:type="spellEnd"/>
-      <w:r>
-        <w:rPr>
-          <w:lang w:val="es-ES"/>
-        </w:rPr>
-        <w:t xml:space="preserve">, si </w:t>
-      </w:r>
-      <w:proofErr w:type="spellStart"/>
-      <w:r>
-        <w:rPr>
-          <w:lang w:val="es-ES"/>
-        </w:rPr>
-        <w:t>invoicing-service</w:t>
-      </w:r>
-      <w:proofErr w:type="spellEnd"/>
-      <w:r>
-        <w:rPr>
-          <w:lang w:val="es-ES"/>
-        </w:rPr>
-        <w:t xml:space="preserve"> cae, el monedero P2P y las transacciones siguen operando. Cada servicio falla de forma independiente, lo que se traduce directamente en mayor disponibilidad para el usuario final.</w:t>
-      </w:r>
-      <w:bookmarkEnd w:id="11"/>
+      <w:r>
+        <w:rPr>
+          <w:b/>
+          <w:lang w:val="es-ES"/>
+        </w:rPr>
+        <w:t xml:space="preserve">Aislamiento de fallos. </w:t>
+      </w:r>
+      <w:r>
+        <w:rPr>
+          <w:lang w:val="es-ES"/>
+        </w:rPr>
+        <w:t xml:space="preserve">Si un servicio cae (p. ej. invoicing-service), el resto —monedero y transacciones— sigue operativo, lo que aumenta la disponibilidad.</w:t>
+      </w:r>
     </w:p>
     <w:p>
       <w:pPr>
@@ -7052,70 +6831,19 @@
           <w:lang w:val="es-ES"/>
         </w:rPr>
       </w:pPr>
-      <w:bookmarkStart w:id="12" w:name="_Toc231290025"/>
-      <w:r>
-        <w:rPr>
+      <w:r>
+        <w:rPr>
+          <w:b/>
           <w:lang w:val="es-ES"/>
         </w:rPr>
         <w:t xml:space="preserve">Escalado selectivo. </w:t>
       </w:r>
-      <w:proofErr w:type="spellStart"/>
-      <w:r>
-        <w:rPr>
-          <w:lang w:val="es-ES"/>
-        </w:rPr>
-        <w:t>transaction-service</w:t>
-      </w:r>
-      <w:proofErr w:type="spellEnd"/>
-      <w:r>
-        <w:rPr>
-          <w:lang w:val="es-ES"/>
-        </w:rPr>
-        <w:t xml:space="preserve"> y </w:t>
-      </w:r>
-      <w:proofErr w:type="spellStart"/>
-      <w:r>
-        <w:rPr>
-          <w:lang w:val="es-ES"/>
-        </w:rPr>
-        <w:t>wallet-service</w:t>
-      </w:r>
-      <w:proofErr w:type="spellEnd"/>
-      <w:r>
-        <w:rPr>
-          <w:lang w:val="es-ES"/>
-        </w:rPr>
-        <w:t xml:space="preserve"> soportarán la mayor carga operacional. Con microservicios, se pueden escalar esos dos servicios horizontalmente —añadiendo instancias registradas en Eureka— sin desperdiciar recursos escalando </w:t>
-      </w:r>
-      <w:proofErr w:type="spellStart"/>
-      <w:r>
-        <w:rPr>
-          <w:lang w:val="es-ES"/>
-        </w:rPr>
-        <w:t>invoicing-service</w:t>
-      </w:r>
-      <w:proofErr w:type="spellEnd"/>
-      <w:r>
-        <w:rPr>
-          <w:lang w:val="es-ES"/>
-        </w:rPr>
-        <w:t xml:space="preserve"> o </w:t>
-      </w:r>
-      <w:proofErr w:type="spellStart"/>
-      <w:r>
-        <w:rPr>
-          <w:lang w:val="es-ES"/>
-        </w:rPr>
-        <w:t>bank-service</w:t>
-      </w:r>
-      <w:proofErr w:type="spellEnd"/>
-      <w:r>
-        <w:rPr>
-          <w:lang w:val="es-ES"/>
-        </w:rPr>
-        <w:t>, que tienen tráfico mucho más bajo.</w:t>
-      </w:r>
-      <w:bookmarkEnd w:id="12"/>
+      <w:r>
+        <w:rPr>
+          <w:lang w:val="es-ES"/>
+        </w:rPr>
+        <w:t xml:space="preserve">Los servicios con más carga (transaction y wallet) se escalan horizontalmente con instancias registradas en Eureka, sin escalar los de menor tráfico.</w:t>
+      </w:r>
     </w:p>
     <w:p>
       <w:pPr>
@@ -7124,42 +6852,19 @@
           <w:lang w:val="es-ES"/>
         </w:rPr>
       </w:pPr>
-      <w:bookmarkStart w:id="13" w:name="_Toc231290026"/>
-      <w:r>
-        <w:rPr>
-          <w:lang w:val="es-ES"/>
-        </w:rPr>
-        <w:t xml:space="preserve">Autonomía de base de datos. Cada servicio posee su propio esquema en la base de datos (separación gestionada en </w:t>
-      </w:r>
-      <w:proofErr w:type="spellStart"/>
-      <w:r>
-        <w:rPr>
-          <w:lang w:val="es-ES"/>
-        </w:rPr>
-        <w:t>init.sql</w:t>
-      </w:r>
-      <w:proofErr w:type="spellEnd"/>
-      <w:r>
-        <w:rPr>
-          <w:lang w:val="es-ES"/>
-        </w:rPr>
-        <w:t xml:space="preserve">). Esto evita el acoplamiento de datos que hace que los monolitos sean tan difíciles de mantener: ningún servicio puede corromper el modelo de datos de otro, y se puede cambiar el esquema de </w:t>
-      </w:r>
-      <w:proofErr w:type="spellStart"/>
-      <w:r>
-        <w:rPr>
-          <w:lang w:val="es-ES"/>
-        </w:rPr>
-        <w:t>auth-service</w:t>
-      </w:r>
-      <w:proofErr w:type="spellEnd"/>
-      <w:r>
-        <w:rPr>
-          <w:lang w:val="es-ES"/>
-        </w:rPr>
-        <w:t xml:space="preserve"> sin tocar el resto.</w:t>
-      </w:r>
-      <w:bookmarkEnd w:id="13"/>
+      <w:r>
+        <w:rPr>
+          <w:b/>
+          <w:lang w:val="es-ES"/>
+        </w:rPr>
+        <w:t xml:space="preserve">Autonomía de datos. </w:t>
+      </w:r>
+      <w:r>
+        <w:rPr>
+          <w:lang w:val="es-ES"/>
+        </w:rPr>
+        <w:t xml:space="preserve">Cada servicio tiene su propio esquema (definido en init.sql); ninguno accede a las tablas de otro, evitando el acoplamiento del monolito.</w:t>
+      </w:r>
     </w:p>
     <w:p>
       <w:pPr>
@@ -7168,56 +6873,19 @@
           <w:lang w:val="es-ES"/>
         </w:rPr>
       </w:pPr>
-      <w:bookmarkStart w:id="14" w:name="_Toc231290027"/>
-      <w:r>
-        <w:rPr>
-          <w:lang w:val="es-ES"/>
-        </w:rPr>
-        <w:t xml:space="preserve">Seguridad por capas. El API Gateway centraliza la validación del token JWT y el control de acceso por roles </w:t>
-      </w:r>
-      <w:r>
-        <w:rPr>
-          <w:i/>
-          <w:iCs/>
-          <w:lang w:val="es-ES"/>
-        </w:rPr>
-        <w:t>antes</w:t>
-      </w:r>
-      <w:r>
-        <w:rPr>
-          <w:lang w:val="es-ES"/>
-        </w:rPr>
-        <w:t xml:space="preserve"> de que ninguna petición llegue a los servicios internos. Esto significa que </w:t>
-      </w:r>
-      <w:proofErr w:type="spellStart"/>
-      <w:r>
-        <w:rPr>
-          <w:lang w:val="es-ES"/>
-        </w:rPr>
-        <w:t>transaction-service</w:t>
-      </w:r>
-      <w:proofErr w:type="spellEnd"/>
-      <w:r>
-        <w:rPr>
-          <w:lang w:val="es-ES"/>
-        </w:rPr>
-        <w:t xml:space="preserve"> o </w:t>
-      </w:r>
-      <w:proofErr w:type="spellStart"/>
-      <w:r>
-        <w:rPr>
-          <w:lang w:val="es-ES"/>
-        </w:rPr>
-        <w:t>bank-service</w:t>
-      </w:r>
-      <w:proofErr w:type="spellEnd"/>
-      <w:r>
-        <w:rPr>
-          <w:lang w:val="es-ES"/>
-        </w:rPr>
-        <w:t xml:space="preserve"> nunca procesan una petición no autenticada: el perímetro de seguridad está definido en un único punto, pero cada servicio puede añadir su propia capa de autorización si el dominio lo requiere.</w:t>
-      </w:r>
-      <w:bookmarkEnd w:id="14"/>
+      <w:r>
+        <w:rPr>
+          <w:b/>
+          <w:lang w:val="es-ES"/>
+        </w:rPr>
+        <w:t xml:space="preserve">Seguridad por capas. </w:t>
+      </w:r>
+      <w:r>
+        <w:rPr>
+          <w:lang w:val="es-ES"/>
+        </w:rPr>
+        <w:t xml:space="preserve">El API Gateway centraliza la validación del JWT y el control de roles, de modo que ningún servicio interno procesa peticiones no autenticadas.</w:t>
+      </w:r>
     </w:p>
     <w:p>
       <w:pPr>
@@ -7226,127 +6894,19 @@
           <w:lang w:val="es-ES"/>
         </w:rPr>
       </w:pPr>
-      <w:bookmarkStart w:id="15" w:name="_Toc231290028"/>
-      <w:r>
-        <w:rPr>
-          <w:lang w:val="es-ES"/>
-        </w:rPr>
-        <w:lastRenderedPageBreak/>
-        <w:t xml:space="preserve">Separación de responsabilidades de negocio. Open </w:t>
-      </w:r>
-      <w:proofErr w:type="spellStart"/>
-      <w:r>
-        <w:rPr>
-          <w:lang w:val="es-ES"/>
-        </w:rPr>
-        <w:t>Banking</w:t>
-      </w:r>
-      <w:proofErr w:type="spellEnd"/>
-      <w:r>
-        <w:rPr>
-          <w:lang w:val="es-ES"/>
-        </w:rPr>
-        <w:t xml:space="preserve"> (</w:t>
-      </w:r>
-      <w:proofErr w:type="spellStart"/>
-      <w:r>
-        <w:rPr>
-          <w:lang w:val="es-ES"/>
-        </w:rPr>
-        <w:t>bank-service</w:t>
-      </w:r>
-      <w:proofErr w:type="spellEnd"/>
-      <w:r>
-        <w:rPr>
-          <w:lang w:val="es-ES"/>
-        </w:rPr>
-        <w:t xml:space="preserve"> vía </w:t>
-      </w:r>
-      <w:proofErr w:type="spellStart"/>
-      <w:r>
-        <w:rPr>
-          <w:lang w:val="es-ES"/>
-        </w:rPr>
-        <w:t>Nordigen</w:t>
-      </w:r>
-      <w:proofErr w:type="spellEnd"/>
-      <w:r>
-        <w:rPr>
-          <w:lang w:val="es-ES"/>
-        </w:rPr>
-        <w:t>/</w:t>
-      </w:r>
-      <w:proofErr w:type="spellStart"/>
-      <w:r>
-        <w:rPr>
-          <w:lang w:val="es-ES"/>
-        </w:rPr>
-        <w:t>GoCardless</w:t>
-      </w:r>
-      <w:proofErr w:type="spellEnd"/>
-      <w:r>
-        <w:rPr>
-          <w:lang w:val="es-ES"/>
-        </w:rPr>
-        <w:t xml:space="preserve">) tiene una superficie de integración externa con su propio </w:t>
-      </w:r>
-      <w:proofErr w:type="spellStart"/>
-      <w:r>
-        <w:rPr>
-          <w:lang w:val="es-ES"/>
-        </w:rPr>
-        <w:t>rate</w:t>
-      </w:r>
-      <w:proofErr w:type="spellEnd"/>
-      <w:r>
-        <w:rPr>
-          <w:lang w:val="es-ES"/>
-        </w:rPr>
-        <w:t xml:space="preserve"> </w:t>
-      </w:r>
-      <w:proofErr w:type="spellStart"/>
-      <w:r>
-        <w:rPr>
-          <w:lang w:val="es-ES"/>
-        </w:rPr>
-        <w:t>limiting</w:t>
-      </w:r>
-      <w:proofErr w:type="spellEnd"/>
-      <w:r>
-        <w:rPr>
-          <w:lang w:val="es-ES"/>
-        </w:rPr>
-        <w:t xml:space="preserve">, gestión de tokens OAuth y posibles cambios de API. Stripe en </w:t>
-      </w:r>
-      <w:proofErr w:type="spellStart"/>
-      <w:r>
-        <w:rPr>
-          <w:lang w:val="es-ES"/>
-        </w:rPr>
-        <w:t>auth-service</w:t>
-      </w:r>
-      <w:proofErr w:type="spellEnd"/>
-      <w:r>
-        <w:rPr>
-          <w:lang w:val="es-ES"/>
-        </w:rPr>
-        <w:t xml:space="preserve"> tiene sus propios </w:t>
-      </w:r>
-      <w:proofErr w:type="spellStart"/>
-      <w:r>
-        <w:rPr>
-          <w:lang w:val="es-ES"/>
-        </w:rPr>
-        <w:t>webhooks</w:t>
-      </w:r>
-      <w:proofErr w:type="spellEnd"/>
-      <w:r>
-        <w:rPr>
-          <w:lang w:val="es-ES"/>
-        </w:rPr>
-        <w:t>. Aislar estas integraciones evita que un cambio de terceros afecte al resto del sistema.</w:t>
-      </w:r>
-      <w:bookmarkEnd w:id="15"/>
+      <w:r>
+        <w:rPr>
+          <w:b/>
+          <w:lang w:val="es-ES"/>
+        </w:rPr>
+        <w:t xml:space="preserve">Separación de responsabilidades. </w:t>
+      </w:r>
+      <w:r>
+        <w:rPr>
+          <w:lang w:val="es-ES"/>
+        </w:rPr>
+        <w:t xml:space="preserve">Aislar las integraciones externas (Open Banking en bank-service, Stripe en auth-service) evita que un cambio de terceros afecte al resto del sistema.</w:t>
+      </w:r>
     </w:p>
     <w:p>
       <w:pPr>
@@ -7355,112 +6915,19 @@
           <w:lang w:val="es-ES"/>
         </w:rPr>
       </w:pPr>
-      <w:bookmarkStart w:id="16" w:name="_Toc231290029"/>
-      <w:r>
-        <w:rPr>
-          <w:lang w:val="es-ES"/>
-        </w:rPr>
-        <w:t xml:space="preserve">Despliegue independiente. La orquestación completa vive en un único </w:t>
-      </w:r>
-      <w:proofErr w:type="spellStart"/>
-      <w:r>
-        <w:rPr>
-          <w:lang w:val="es-ES"/>
-        </w:rPr>
-        <w:t>docker-compose.yml</w:t>
-      </w:r>
-      <w:proofErr w:type="spellEnd"/>
-      <w:r>
-        <w:rPr>
-          <w:lang w:val="es-ES"/>
-        </w:rPr>
-        <w:t xml:space="preserve">, pero cada servicio tiene su propio ciclo de </w:t>
-      </w:r>
-      <w:proofErr w:type="spellStart"/>
-      <w:r>
-        <w:rPr>
-          <w:lang w:val="es-ES"/>
-        </w:rPr>
-        <w:t>build</w:t>
-      </w:r>
-      <w:proofErr w:type="spellEnd"/>
-      <w:r>
-        <w:rPr>
-          <w:lang w:val="es-ES"/>
-        </w:rPr>
-        <w:t xml:space="preserve">. Se puede desplegar un </w:t>
-      </w:r>
-      <w:proofErr w:type="spellStart"/>
-      <w:r>
-        <w:rPr>
-          <w:lang w:val="es-ES"/>
-        </w:rPr>
-        <w:t>fix</w:t>
-      </w:r>
-      <w:proofErr w:type="spellEnd"/>
-      <w:r>
-        <w:rPr>
-          <w:lang w:val="es-ES"/>
-        </w:rPr>
-        <w:t xml:space="preserve"> en </w:t>
-      </w:r>
-      <w:proofErr w:type="spellStart"/>
-      <w:r>
-        <w:rPr>
-          <w:lang w:val="es-ES"/>
-        </w:rPr>
-        <w:t>invoicing-service</w:t>
-      </w:r>
-      <w:proofErr w:type="spellEnd"/>
-      <w:r>
-        <w:rPr>
-          <w:lang w:val="es-ES"/>
-        </w:rPr>
-        <w:t xml:space="preserve"> sin necesidad de </w:t>
-      </w:r>
-      <w:proofErr w:type="spellStart"/>
-      <w:r>
-        <w:rPr>
-          <w:lang w:val="es-ES"/>
-        </w:rPr>
-        <w:t>redeployar</w:t>
-      </w:r>
-      <w:proofErr w:type="spellEnd"/>
-      <w:r>
-        <w:rPr>
-          <w:lang w:val="es-ES"/>
-        </w:rPr>
-        <w:t xml:space="preserve"> ni </w:t>
-      </w:r>
-      <w:proofErr w:type="spellStart"/>
-      <w:r>
-        <w:rPr>
-          <w:lang w:val="es-ES"/>
-        </w:rPr>
-        <w:t>wallet-service</w:t>
-      </w:r>
-      <w:proofErr w:type="spellEnd"/>
-      <w:r>
-        <w:rPr>
-          <w:lang w:val="es-ES"/>
-        </w:rPr>
-        <w:t xml:space="preserve"> ni </w:t>
-      </w:r>
-      <w:proofErr w:type="spellStart"/>
-      <w:r>
-        <w:rPr>
-          <w:lang w:val="es-ES"/>
-        </w:rPr>
-        <w:t>transaction-service</w:t>
-      </w:r>
-      <w:proofErr w:type="spellEnd"/>
-      <w:r>
-        <w:rPr>
-          <w:lang w:val="es-ES"/>
-        </w:rPr>
-        <w:t>.</w:t>
-      </w:r>
-      <w:bookmarkEnd w:id="16"/>
+      <w:r>
+        <w:rPr>
+          <w:b/>
+          <w:lang w:val="es-ES"/>
+        </w:rPr>
+        <w:t xml:space="preserve">Despliegue independiente. </w:t>
+      </w:r>
+      <w:r>
+        <w:rPr>
+          <w:lang w:val="es-ES"/>
+        </w:rPr>
+        <w:t xml:space="preserve">Cada servicio tiene su propio ciclo de build dentro de un único docker-compose.yml, por lo que se puede actualizar uno sin redesplegar los demás.</w:t>
+      </w:r>
     </w:p>
     <w:p>
       <w:pPr>
@@ -7537,133 +7004,7 @@
         <w:rPr>
           <w:lang w:val="es-ES"/>
         </w:rPr>
-        <w:t xml:space="preserve">El flujo de datos es el siguiente </w:t>
-      </w:r>
-      <w:proofErr w:type="spellStart"/>
-      <w:r>
-        <w:rPr>
-          <w:lang w:val="es-ES"/>
-        </w:rPr>
-        <w:t>frontend</w:t>
-      </w:r>
-      <w:proofErr w:type="spellEnd"/>
-      <w:r>
-        <w:rPr>
-          <w:lang w:val="es-ES"/>
-        </w:rPr>
-        <w:t xml:space="preserve"> </w:t>
-      </w:r>
-      <w:proofErr w:type="spellStart"/>
-      <w:r>
-        <w:rPr>
-          <w:lang w:val="es-ES"/>
-        </w:rPr>
-        <w:t>React</w:t>
-      </w:r>
-      <w:proofErr w:type="spellEnd"/>
-      <w:r>
-        <w:rPr>
-          <w:lang w:val="es-ES"/>
-        </w:rPr>
-        <w:t xml:space="preserve"> envía todas las peticiones al API Gateway (:8080), que valida el JWT y enruta. El Gateway descubre los servicios mediante Eureka (:8761), donde cada microservicio se registra al arrancar. Los cinco microservicios Spring Boot (</w:t>
-      </w:r>
-      <w:proofErr w:type="spellStart"/>
-      <w:r>
-        <w:rPr>
-          <w:lang w:val="es-ES"/>
-        </w:rPr>
-        <w:t>auth</w:t>
-      </w:r>
-      <w:proofErr w:type="spellEnd"/>
-      <w:r>
-        <w:rPr>
-          <w:lang w:val="es-ES"/>
-        </w:rPr>
-        <w:t xml:space="preserve">, </w:t>
-      </w:r>
-      <w:proofErr w:type="spellStart"/>
-      <w:r>
-        <w:rPr>
-          <w:lang w:val="es-ES"/>
-        </w:rPr>
-        <w:t>transaction</w:t>
-      </w:r>
-      <w:proofErr w:type="spellEnd"/>
-      <w:r>
-        <w:rPr>
-          <w:lang w:val="es-ES"/>
-        </w:rPr>
-        <w:t xml:space="preserve">, </w:t>
-      </w:r>
-      <w:proofErr w:type="spellStart"/>
-      <w:r>
-        <w:rPr>
-          <w:lang w:val="es-ES"/>
-        </w:rPr>
-        <w:t>wallet</w:t>
-      </w:r>
-      <w:proofErr w:type="spellEnd"/>
-      <w:r>
-        <w:rPr>
-          <w:lang w:val="es-ES"/>
-        </w:rPr>
-        <w:t xml:space="preserve">, </w:t>
-      </w:r>
-      <w:proofErr w:type="spellStart"/>
-      <w:r>
-        <w:rPr>
-          <w:lang w:val="es-ES"/>
-        </w:rPr>
-        <w:t>bank</w:t>
-      </w:r>
-      <w:proofErr w:type="spellEnd"/>
-      <w:r>
-        <w:rPr>
-          <w:lang w:val="es-ES"/>
-        </w:rPr>
-        <w:t xml:space="preserve">, </w:t>
-      </w:r>
-      <w:proofErr w:type="spellStart"/>
-      <w:r>
-        <w:rPr>
-          <w:lang w:val="es-ES"/>
-        </w:rPr>
-        <w:t>invoicing</w:t>
-      </w:r>
-      <w:proofErr w:type="spellEnd"/>
-      <w:r>
-        <w:rPr>
-          <w:lang w:val="es-ES"/>
-        </w:rPr>
-        <w:t xml:space="preserve">) tienen cada uno su responsabilidad acotada y su propia base de datos PostgreSQL lo que garantiza el desacoplamiento. Algunos servicios se integran con </w:t>
-      </w:r>
-      <w:proofErr w:type="spellStart"/>
-      <w:r>
-        <w:rPr>
-          <w:lang w:val="es-ES"/>
-        </w:rPr>
-        <w:t>APIs</w:t>
-      </w:r>
-      <w:proofErr w:type="spellEnd"/>
-      <w:r>
-        <w:rPr>
-          <w:lang w:val="es-ES"/>
-        </w:rPr>
-        <w:t xml:space="preserve"> externas: Stripe para pagos y </w:t>
-      </w:r>
-      <w:proofErr w:type="spellStart"/>
-      <w:r>
-        <w:rPr>
-          <w:lang w:val="es-ES"/>
-        </w:rPr>
-        <w:t>Nordigen</w:t>
-      </w:r>
-      <w:proofErr w:type="spellEnd"/>
-      <w:r>
-        <w:rPr>
-          <w:lang w:val="es-ES"/>
-        </w:rPr>
-        <w:t xml:space="preserve"> para acceso bancario bajo PSD2. El flujo es siempre de arriba a abajo: cliente → Gateway → microservicio → su BD y/o servicio externo → respuesta de vuelta.</w:t>
+        <w:t xml:space="preserve">El frontend envía todas las peticiones al API Gateway (:8080), que valida el JWT y las enruta al microservicio correspondiente, localizado mediante Eureka (:8761). Cada uno de los cinco microservicios tiene una responsabilidad acotada y su propia base de datos PostgreSQL. Algunos se integran con APIs externas (Stripe y Nordigen). El flujo es siempre cliente → Gateway → microservicio → base de datos o servicio externo → respuesta.</w:t>
       </w:r>
     </w:p>
     <w:p>
@@ -7730,107 +7071,25 @@
       </w:pPr>
       <w:r>
         <w:rPr>
+          <w:lang w:val="es-ES"/>
+        </w:rPr>
+        <w:t xml:space="preserve">Si la ruta requiere autenticación, el Gateway valida el token: si no es válido devuelve 401; si lo es, reenvía la petición con las cabeceras X-User-Id, X-User-Email y X-User-Rol. El microservicio aplica su lógica, consulta su base de datos y responde en JSON. La autenticación queda así centralizada y los servicios solo confían en las cabeceras inyectadas por el Gateway.</w:t>
+      </w:r>
+    </w:p>
+    <w:p>
+      <w:pPr>
+        <w:jc w:val="center"/>
+        <w:rPr>
           <w:sz w:val="20"/>
           <w:szCs w:val="20"/>
           <w:lang w:val="es-ES"/>
         </w:rPr>
-        <w:t xml:space="preserve">El usuario realiza una acción en la SPA y el cliente envía la petición al API Gateway. Si la ruta requiere autenticación, el Gateway valida el token JWT: si no es válido, responde 401 </w:t>
-      </w:r>
-      <w:proofErr w:type="spellStart"/>
-      <w:r>
-        <w:rPr>
-          <w:sz w:val="20"/>
-          <w:szCs w:val="20"/>
-          <w:lang w:val="es-ES"/>
-        </w:rPr>
-        <w:t>Unauthorized</w:t>
-      </w:r>
-      <w:proofErr w:type="spellEnd"/>
-      <w:r>
-        <w:rPr>
-          <w:sz w:val="20"/>
-          <w:szCs w:val="20"/>
-          <w:lang w:val="es-ES"/>
-        </w:rPr>
-        <w:t>; si lo es, reenvía la petición al microservicio con las cabeceras X-</w:t>
-      </w:r>
-      <w:proofErr w:type="spellStart"/>
-      <w:r>
-        <w:rPr>
-          <w:sz w:val="20"/>
-          <w:szCs w:val="20"/>
-          <w:lang w:val="es-ES"/>
-        </w:rPr>
-        <w:t>User</w:t>
-      </w:r>
-      <w:proofErr w:type="spellEnd"/>
-      <w:r>
-        <w:rPr>
-          <w:sz w:val="20"/>
-          <w:szCs w:val="20"/>
-          <w:lang w:val="es-ES"/>
-        </w:rPr>
-        <w:t>-Id, X-</w:t>
-      </w:r>
-      <w:proofErr w:type="spellStart"/>
-      <w:r>
-        <w:rPr>
-          <w:sz w:val="20"/>
-          <w:szCs w:val="20"/>
-          <w:lang w:val="es-ES"/>
-        </w:rPr>
-        <w:t>User</w:t>
-      </w:r>
-      <w:proofErr w:type="spellEnd"/>
-      <w:r>
-        <w:rPr>
-          <w:sz w:val="20"/>
-          <w:szCs w:val="20"/>
-          <w:lang w:val="es-ES"/>
-        </w:rPr>
-        <w:t>-Email y X-</w:t>
-      </w:r>
-      <w:proofErr w:type="spellStart"/>
-      <w:r>
-        <w:rPr>
-          <w:sz w:val="20"/>
-          <w:szCs w:val="20"/>
-          <w:lang w:val="es-ES"/>
-        </w:rPr>
-        <w:t>User</w:t>
-      </w:r>
-      <w:proofErr w:type="spellEnd"/>
-      <w:r>
-        <w:rPr>
-          <w:sz w:val="20"/>
-          <w:szCs w:val="20"/>
-          <w:lang w:val="es-ES"/>
-        </w:rPr>
-        <w:t>-Rol. El microservicio aplica su lógica de negocio, consulta su base de datos PostgreSQL y devuelve la respuesta en JSON, con la que el cliente actualiza la interfaz. Así la autenticación queda centralizada en el Gateway y los microservicios solo confían en las cabeceras que este les inyecta</w:t>
-      </w:r>
-      <w:r>
-        <w:rPr>
-          <w:sz w:val="20"/>
-          <w:szCs w:val="20"/>
-          <w:lang w:val="es-ES"/>
-        </w:rPr>
-        <w:br w:type="page"/>
-      </w:r>
+      </w:pPr>
     </w:p>
     <w:p>
       <w:pPr>
         <w:jc w:val="center"/>
         <w:rPr>
-          <w:sz w:val="20"/>
-          <w:szCs w:val="20"/>
-          <w:lang w:val="es-ES"/>
-        </w:rPr>
-      </w:pPr>
-    </w:p>
-    <w:p>
-      <w:pPr>
-        <w:jc w:val="center"/>
-        <w:rPr>
           <w:lang w:val="es-ES"/>
         </w:rPr>
       </w:pPr>
@@ -7861,63 +7120,7 @@
         <w:rPr>
           <w:lang w:val="es-ES"/>
         </w:rPr>
-        <w:t xml:space="preserve">La plataforma se compone de siete microservicios </w:t>
-      </w:r>
-      <w:proofErr w:type="spellStart"/>
-      <w:r>
-        <w:rPr>
-          <w:lang w:val="es-ES"/>
-        </w:rPr>
-        <w:t>backend</w:t>
-      </w:r>
-      <w:proofErr w:type="spellEnd"/>
-      <w:r>
-        <w:rPr>
-          <w:lang w:val="es-ES"/>
-        </w:rPr>
-        <w:t xml:space="preserve"> (cinco de negocio más el </w:t>
-      </w:r>
-      <w:proofErr w:type="spellStart"/>
-      <w:r>
-        <w:rPr>
-          <w:lang w:val="es-ES"/>
-        </w:rPr>
-        <w:t>gateway</w:t>
-      </w:r>
-      <w:proofErr w:type="spellEnd"/>
-      <w:r>
-        <w:rPr>
-          <w:lang w:val="es-ES"/>
-        </w:rPr>
-        <w:t xml:space="preserve"> y el registro de servicios) y un </w:t>
-      </w:r>
-      <w:proofErr w:type="spellStart"/>
-      <w:r>
-        <w:rPr>
-          <w:lang w:val="es-ES"/>
-        </w:rPr>
-        <w:t>frontend</w:t>
-      </w:r>
-      <w:proofErr w:type="spellEnd"/>
-      <w:r>
-        <w:rPr>
-          <w:lang w:val="es-ES"/>
-        </w:rPr>
-        <w:t xml:space="preserve">. A </w:t>
-      </w:r>
-      <w:proofErr w:type="gramStart"/>
-      <w:r>
-        <w:rPr>
-          <w:lang w:val="es-ES"/>
-        </w:rPr>
-        <w:t>continuación</w:t>
-      </w:r>
-      <w:proofErr w:type="gramEnd"/>
-      <w:r>
-        <w:rPr>
-          <w:lang w:val="es-ES"/>
-        </w:rPr>
-        <w:t xml:space="preserve"> se describe cada módulo con su descripción, sus funcionalidades y sus dependencias.</w:t>
+        <w:t xml:space="preserve">La plataforma consta de siete microservicios (cinco de negocio, el gateway y el registro de servicios) y un frontend. Cada módulo se describe a continuación con su función, capacidades y dependencias.</w:t>
       </w:r>
     </w:p>
     <w:p>
@@ -9521,99 +8724,7 @@
         <w:rPr>
           <w:lang w:val="es-ES"/>
         </w:rPr>
-        <w:t xml:space="preserve">Sistema de diseño: centralizado en </w:t>
-      </w:r>
-      <w:proofErr w:type="spellStart"/>
-      <w:r>
-        <w:rPr>
-          <w:lang w:val="es-ES"/>
-        </w:rPr>
-        <w:t>design-</w:t>
-      </w:r>
-      <w:proofErr w:type="gramStart"/>
-      <w:r>
-        <w:rPr>
-          <w:lang w:val="es-ES"/>
-        </w:rPr>
-        <w:t>system.scss</w:t>
-      </w:r>
-      <w:proofErr w:type="spellEnd"/>
-      <w:proofErr w:type="gramEnd"/>
-      <w:r>
-        <w:rPr>
-          <w:lang w:val="es-ES"/>
-        </w:rPr>
-        <w:t xml:space="preserve"> (SASS). Una paleta primitiva en variables SASS (teal #0891b2 como color primario) alimenta tokens semánticos como CSS </w:t>
-      </w:r>
-      <w:proofErr w:type="spellStart"/>
-      <w:r>
-        <w:rPr>
-          <w:lang w:val="es-ES"/>
-        </w:rPr>
-        <w:t>Custom</w:t>
-      </w:r>
-      <w:proofErr w:type="spellEnd"/>
-      <w:r>
-        <w:rPr>
-          <w:lang w:val="es-ES"/>
-        </w:rPr>
-        <w:t xml:space="preserve"> </w:t>
-      </w:r>
-      <w:proofErr w:type="spellStart"/>
-      <w:r>
-        <w:rPr>
-          <w:lang w:val="es-ES"/>
-        </w:rPr>
-        <w:t>Properties</w:t>
-      </w:r>
-      <w:proofErr w:type="spellEnd"/>
-      <w:r>
-        <w:rPr>
-          <w:lang w:val="es-ES"/>
-        </w:rPr>
-        <w:t xml:space="preserve">, permitiendo tema claro/oscuro en caliente. Tipografía principal Geist. Estilos por vista con CSS Modules; gráficos con </w:t>
-      </w:r>
-      <w:proofErr w:type="spellStart"/>
-      <w:r>
-        <w:rPr>
-          <w:lang w:val="es-ES"/>
-        </w:rPr>
-        <w:t>Recharts</w:t>
-      </w:r>
-      <w:proofErr w:type="spellEnd"/>
-      <w:r>
-        <w:rPr>
-          <w:lang w:val="es-ES"/>
-        </w:rPr>
-        <w:t xml:space="preserve">; enrutado con </w:t>
-      </w:r>
-      <w:proofErr w:type="spellStart"/>
-      <w:r>
-        <w:rPr>
-          <w:lang w:val="es-ES"/>
-        </w:rPr>
-        <w:t>React</w:t>
-      </w:r>
-      <w:proofErr w:type="spellEnd"/>
-      <w:r>
-        <w:rPr>
-          <w:lang w:val="es-ES"/>
-        </w:rPr>
-        <w:t xml:space="preserve"> </w:t>
-      </w:r>
-      <w:proofErr w:type="spellStart"/>
-      <w:r>
-        <w:rPr>
-          <w:lang w:val="es-ES"/>
-        </w:rPr>
-        <w:t>Router</w:t>
-      </w:r>
-      <w:proofErr w:type="spellEnd"/>
-      <w:r>
-        <w:rPr>
-          <w:lang w:val="es-ES"/>
-        </w:rPr>
-        <w:t xml:space="preserve"> 7.</w:t>
+        <w:t xml:space="preserve">El sistema de diseño se centraliza en design-system.scss: una paleta primitiva en variables SASS (teal #0891b2) alimenta tokens semánticos (CSS Custom Properties) que permiten alternar tema claro/oscuro en caliente. Tipografía Geist, estilos por vista con CSS Modules, gráficos con Recharts y enrutado con React Router 7.</w:t>
       </w:r>
     </w:p>
     <w:p>
@@ -9915,48 +9026,20 @@
         <w:rPr>
           <w:lang w:val="es-ES"/>
         </w:rPr>
-        <w:t xml:space="preserve">La navegación se realiza desde una barra lateral en escritorio y una barra inferior en móvil, lo que mantiene accesibles las secciones principales en cualquier dispositivo. Tras iniciar sesión, el usuario aterriza en el </w:t>
-      </w:r>
-      <w:proofErr w:type="spellStart"/>
-      <w:r>
-        <w:rPr>
-          <w:lang w:val="es-ES"/>
-        </w:rPr>
-        <w:t>dashboard</w:t>
-      </w:r>
-      <w:proofErr w:type="spellEnd"/>
-      <w:r>
-        <w:rPr>
-          <w:lang w:val="es-ES"/>
-        </w:rPr>
-        <w:t>, que ofrece una visión general de su situación financiera (saldo, evolución de ingresos y gastos y últimos movimientos).</w:t>
-      </w:r>
-    </w:p>
-    <w:p>
-      <w:pPr>
-        <w:rPr>
-          <w:lang w:val="es-ES"/>
-        </w:rPr>
-      </w:pPr>
-      <w:r>
-        <w:rPr>
-          <w:lang w:val="es-ES"/>
-        </w:rPr>
-        <w:t xml:space="preserve">Las acciones frecuentes se resuelven con modales y formularios en línea: enviar o solicitar dinero en el monedero, registrar un ingreso o un gasto, conectar un banco o emitir una factura. Los formularios validan los datos antes de enviarlos al </w:t>
-      </w:r>
-      <w:proofErr w:type="spellStart"/>
-      <w:r>
-        <w:rPr>
-          <w:lang w:val="es-ES"/>
-        </w:rPr>
-        <w:t>backend</w:t>
-      </w:r>
-      <w:proofErr w:type="spellEnd"/>
-      <w:r>
-        <w:rPr>
-          <w:lang w:val="es-ES"/>
-        </w:rPr>
-        <w:t xml:space="preserve"> y muestran mensajes de error claros. El cambio de tema claro/oscuro es inmediato gracias a los tokens de diseño, y el asistente financiero flotante permite consultar datos mediante preguntas en lenguaje natural.</w:t>
+        <w:t xml:space="preserve">La navegación se realiza con una barra lateral en escritorio y una barra inferior en móvil. Tras iniciar sesión, el usuario llega al dashboard, con una visión general de su situación financiera (saldo, evolución de ingresos y gastos y últimos movimientos).</w:t>
+      </w:r>
+    </w:p>
+    <w:p>
+      <w:pPr>
+        <w:rPr>
+          <w:lang w:val="es-ES"/>
+        </w:rPr>
+      </w:pPr>
+      <w:r>
+        <w:rPr>
+          <w:lang w:val="es-ES"/>
+        </w:rPr>
+        <w:t xml:space="preserve">Las acciones frecuentes se resuelven con modales y formularios en línea (enviar dinero, registrar un ingreso o gasto, conectar un banco o emitir una factura), que validan los datos antes de enviarlos. El cambio de tema es inmediato y el asistente financiero flotante permite consultar datos en lenguaje natural.</w:t>
       </w:r>
     </w:p>
     <w:p>
@@ -10614,57 +9697,7 @@
         <w:rPr>
           <w:lang w:val="es-ES"/>
         </w:rPr>
-        <w:t xml:space="preserve">En desarrollo se puede crear un archivo </w:t>
-      </w:r>
-      <w:proofErr w:type="spellStart"/>
-      <w:r>
-        <w:rPr>
-          <w:lang w:val="es-ES"/>
-        </w:rPr>
-        <w:t>application-</w:t>
-      </w:r>
-      <w:proofErr w:type="gramStart"/>
-      <w:r>
-        <w:rPr>
-          <w:lang w:val="es-ES"/>
-        </w:rPr>
-        <w:t>local.properties</w:t>
-      </w:r>
-      <w:proofErr w:type="spellEnd"/>
-      <w:proofErr w:type="gramEnd"/>
-      <w:r>
-        <w:rPr>
-          <w:lang w:val="es-ES"/>
-        </w:rPr>
-        <w:t xml:space="preserve"> en </w:t>
-      </w:r>
-      <w:proofErr w:type="spellStart"/>
-      <w:r>
-        <w:rPr>
-          <w:lang w:val="es-ES"/>
-        </w:rPr>
-        <w:t>auth-service</w:t>
-      </w:r>
-      <w:proofErr w:type="spellEnd"/>
-      <w:r>
-        <w:rPr>
-          <w:lang w:val="es-ES"/>
-        </w:rPr>
-        <w:t xml:space="preserve"> con esas claves y arrancar con el perfil local (SPRING_PROFILES_ACTIVE=local). Dicho archivo está ignorado por Git, de modo que las claves nunca se versionan. Si </w:t>
-      </w:r>
-      <w:proofErr w:type="spellStart"/>
-      <w:r>
-        <w:rPr>
-          <w:lang w:val="es-ES"/>
-        </w:rPr>
-        <w:t>auth-service</w:t>
-      </w:r>
-      <w:proofErr w:type="spellEnd"/>
-      <w:r>
-        <w:rPr>
-          <w:lang w:val="es-ES"/>
-        </w:rPr>
-        <w:t xml:space="preserve"> detecta el secreto JWT por defecto, avisa por consola.</w:t>
+        <w:t xml:space="preserve">En desarrollo puede usarse un archivo application-local.properties (perfil local) con dichas claves; está ignorado por Git, por lo que nunca se versionan. Si auth-service detecta el secreto JWT por defecto, avisa por consola.</w:t>
       </w:r>
     </w:p>
     <w:p>
@@ -11024,203 +10057,7 @@
         <w:rPr>
           <w:lang w:val="es-ES"/>
         </w:rPr>
-        <w:t xml:space="preserve">El despliegue se realiza con las mismas imágenes Docker usadas en local. En un servidor (VPS o plataforma </w:t>
-      </w:r>
-      <w:proofErr w:type="spellStart"/>
-      <w:r>
-        <w:rPr>
-          <w:lang w:val="es-ES"/>
-        </w:rPr>
-        <w:t>cloud</w:t>
-      </w:r>
-      <w:proofErr w:type="spellEnd"/>
-      <w:r>
-        <w:rPr>
-          <w:lang w:val="es-ES"/>
-        </w:rPr>
-        <w:t xml:space="preserve">) basta con instalar Docker y Docker </w:t>
-      </w:r>
-      <w:proofErr w:type="spellStart"/>
-      <w:r>
-        <w:rPr>
-          <w:lang w:val="es-ES"/>
-        </w:rPr>
-        <w:t>Compose</w:t>
-      </w:r>
-      <w:proofErr w:type="spellEnd"/>
-      <w:r>
-        <w:rPr>
-          <w:lang w:val="es-ES"/>
-        </w:rPr>
-        <w:t xml:space="preserve">, clonar el repositorio, definir las variables de entorno de producción (secretos fuertes, claves reales de Stripe y </w:t>
-      </w:r>
-      <w:proofErr w:type="spellStart"/>
-      <w:r>
-        <w:rPr>
-          <w:lang w:val="es-ES"/>
-        </w:rPr>
-        <w:t>Nordigen</w:t>
-      </w:r>
-      <w:proofErr w:type="spellEnd"/>
-      <w:r>
-        <w:rPr>
-          <w:lang w:val="es-ES"/>
-        </w:rPr>
-        <w:t xml:space="preserve">, URL pública del </w:t>
-      </w:r>
-      <w:proofErr w:type="spellStart"/>
-      <w:r>
-        <w:rPr>
-          <w:lang w:val="es-ES"/>
-        </w:rPr>
-        <w:t>frontend</w:t>
-      </w:r>
-      <w:proofErr w:type="spellEnd"/>
-      <w:r>
-        <w:rPr>
-          <w:lang w:val="es-ES"/>
-        </w:rPr>
-        <w:t xml:space="preserve">) y ejecutar </w:t>
-      </w:r>
-      <w:proofErr w:type="spellStart"/>
-      <w:r>
-        <w:rPr>
-          <w:lang w:val="es-ES"/>
-        </w:rPr>
-        <w:t>docker</w:t>
-      </w:r>
-      <w:proofErr w:type="spellEnd"/>
-      <w:r>
-        <w:rPr>
-          <w:lang w:val="es-ES"/>
-        </w:rPr>
-        <w:t xml:space="preserve"> </w:t>
-      </w:r>
-      <w:proofErr w:type="spellStart"/>
-      <w:r>
-        <w:rPr>
-          <w:lang w:val="es-ES"/>
-        </w:rPr>
-        <w:t>compose</w:t>
-      </w:r>
-      <w:proofErr w:type="spellEnd"/>
-      <w:r>
-        <w:rPr>
-          <w:lang w:val="es-ES"/>
-        </w:rPr>
-        <w:t xml:space="preserve"> up -d --</w:t>
-      </w:r>
-      <w:proofErr w:type="spellStart"/>
-      <w:r>
-        <w:rPr>
-          <w:lang w:val="es-ES"/>
-        </w:rPr>
-        <w:t>build</w:t>
-      </w:r>
-      <w:proofErr w:type="spellEnd"/>
-      <w:r>
-        <w:rPr>
-          <w:lang w:val="es-ES"/>
-        </w:rPr>
-        <w:t>. Se recomienda situar un proxy inverso (</w:t>
-      </w:r>
-      <w:proofErr w:type="spellStart"/>
-      <w:r>
-        <w:rPr>
-          <w:lang w:val="es-ES"/>
-        </w:rPr>
-        <w:t>Nginx</w:t>
-      </w:r>
-      <w:proofErr w:type="spellEnd"/>
-      <w:r>
-        <w:rPr>
-          <w:lang w:val="es-ES"/>
-        </w:rPr>
-        <w:t xml:space="preserve"> o </w:t>
-      </w:r>
-      <w:proofErr w:type="spellStart"/>
-      <w:r>
-        <w:rPr>
-          <w:lang w:val="es-ES"/>
-        </w:rPr>
-        <w:t>Traefik</w:t>
-      </w:r>
-      <w:proofErr w:type="spellEnd"/>
-      <w:r>
-        <w:rPr>
-          <w:lang w:val="es-ES"/>
-        </w:rPr>
-        <w:t xml:space="preserve">) delante del </w:t>
-      </w:r>
-      <w:proofErr w:type="spellStart"/>
-      <w:r>
-        <w:rPr>
-          <w:lang w:val="es-ES"/>
-        </w:rPr>
-        <w:t>gateway</w:t>
-      </w:r>
-      <w:proofErr w:type="spellEnd"/>
-      <w:r>
-        <w:rPr>
-          <w:lang w:val="es-ES"/>
-        </w:rPr>
-        <w:t xml:space="preserve"> para terminar TLS (HTTPS) y servir el </w:t>
-      </w:r>
-      <w:proofErr w:type="spellStart"/>
-      <w:r>
-        <w:rPr>
-          <w:lang w:val="es-ES"/>
-        </w:rPr>
-        <w:t>frontend</w:t>
-      </w:r>
-      <w:proofErr w:type="spellEnd"/>
-      <w:r>
-        <w:rPr>
-          <w:lang w:val="es-ES"/>
-        </w:rPr>
-        <w:t xml:space="preserve"> ya compilado (</w:t>
-      </w:r>
-      <w:proofErr w:type="spellStart"/>
-      <w:r>
-        <w:rPr>
-          <w:lang w:val="es-ES"/>
-        </w:rPr>
-        <w:t>npm</w:t>
-      </w:r>
-      <w:proofErr w:type="spellEnd"/>
-      <w:r>
-        <w:rPr>
-          <w:lang w:val="es-ES"/>
-        </w:rPr>
-        <w:t xml:space="preserve"> run </w:t>
-      </w:r>
-      <w:proofErr w:type="spellStart"/>
-      <w:r>
-        <w:rPr>
-          <w:lang w:val="es-ES"/>
-        </w:rPr>
-        <w:t>build</w:t>
-      </w:r>
-      <w:proofErr w:type="spellEnd"/>
-      <w:r>
-        <w:rPr>
-          <w:lang w:val="es-ES"/>
-        </w:rPr>
-        <w:t xml:space="preserve">). Como mejora futura se contempla automatizar este proceso con un pipeline de CI/CD (GitHub </w:t>
-      </w:r>
-      <w:proofErr w:type="spellStart"/>
-      <w:r>
-        <w:rPr>
-          <w:lang w:val="es-ES"/>
-        </w:rPr>
-        <w:t>Actions</w:t>
-      </w:r>
-      <w:proofErr w:type="spellEnd"/>
-      <w:r>
-        <w:rPr>
-          <w:lang w:val="es-ES"/>
-        </w:rPr>
-        <w:t>).</w:t>
+        <w:t xml:space="preserve">El despliegue emplea las mismas imágenes Docker que en local: basta instalar Docker y Docker Compose, clonar el repositorio, definir las variables de entorno de producción (secretos fuertes, claves reales de Stripe y Nordigen, URL pública) y ejecutar docker compose up -d --build. Se recomienda un proxy inverso (Nginx) delante del gateway para TLS (HTTPS) y servir el frontend compilado. Como mejora futura se contempla un pipeline de CI/CD.</w:t>
       </w:r>
     </w:p>
     <w:p>
@@ -11840,77 +10677,7 @@
         <w:rPr>
           <w:lang w:val="es-ES"/>
         </w:rPr>
-        <w:t xml:space="preserve">El proyecto se ha desarrollado principalmente sobre la rama </w:t>
-      </w:r>
-      <w:proofErr w:type="spellStart"/>
-      <w:r>
-        <w:rPr>
-          <w:lang w:val="es-ES"/>
-        </w:rPr>
-        <w:t>main</w:t>
-      </w:r>
-      <w:proofErr w:type="spellEnd"/>
-      <w:r>
-        <w:rPr>
-          <w:lang w:val="es-ES"/>
-        </w:rPr>
-        <w:t xml:space="preserve">, que contiene siempre una versión estable y desplegable. Para un trabajo en equipo o una evolución continua se recomienda el flujo siguiente: </w:t>
-      </w:r>
-      <w:proofErr w:type="spellStart"/>
-      <w:r>
-        <w:rPr>
-          <w:lang w:val="es-ES"/>
-        </w:rPr>
-        <w:t>main</w:t>
-      </w:r>
-      <w:proofErr w:type="spellEnd"/>
-      <w:r>
-        <w:rPr>
-          <w:lang w:val="es-ES"/>
-        </w:rPr>
-        <w:t xml:space="preserve"> (producción/estable), </w:t>
-      </w:r>
-      <w:proofErr w:type="spellStart"/>
-      <w:r>
-        <w:rPr>
-          <w:lang w:val="es-ES"/>
-        </w:rPr>
-        <w:t>develop</w:t>
-      </w:r>
-      <w:proofErr w:type="spellEnd"/>
-      <w:r>
-        <w:rPr>
-          <w:lang w:val="es-ES"/>
-        </w:rPr>
-        <w:t xml:space="preserve"> (integración) y ramas </w:t>
-      </w:r>
-      <w:proofErr w:type="spellStart"/>
-      <w:r>
-        <w:rPr>
-          <w:lang w:val="es-ES"/>
-        </w:rPr>
-        <w:t>feature</w:t>
-      </w:r>
-      <w:proofErr w:type="spellEnd"/>
-      <w:r>
-        <w:rPr>
-          <w:lang w:val="es-ES"/>
-        </w:rPr>
-        <w:t xml:space="preserve">/&lt;nombre&gt; por funcionalidad, que se fusionan mediante Pull </w:t>
-      </w:r>
-      <w:proofErr w:type="spellStart"/>
-      <w:r>
-        <w:rPr>
-          <w:lang w:val="es-ES"/>
-        </w:rPr>
-        <w:t>Requests</w:t>
-      </w:r>
-      <w:proofErr w:type="spellEnd"/>
-      <w:r>
-        <w:rPr>
-          <w:lang w:val="es-ES"/>
-        </w:rPr>
-        <w:t xml:space="preserve"> revisados.</w:t>
+        <w:t xml:space="preserve">El proyecto se ha desarrollado sobre la rama main, que mantiene siempre una versión estable y desplegable. Para trabajo en equipo se recomienda el flujo main (estable), develop (integración) y ramas feature/&lt;nombre&gt; fusionadas mediante Pull Requests.</w:t>
       </w:r>
     </w:p>
     <w:p>
@@ -12695,35 +11462,7 @@
         <w:rPr>
           <w:lang w:val="es-ES"/>
         </w:rPr>
-        <w:t xml:space="preserve">A fecha de redacción, el repositorio acumula más de 40 commits que reflejan la evolución del proyecto, desde la reestructuración inicial en </w:t>
-      </w:r>
-      <w:proofErr w:type="spellStart"/>
-      <w:r>
-        <w:rPr>
-          <w:lang w:val="es-ES"/>
-        </w:rPr>
-        <w:t>backend</w:t>
-      </w:r>
-      <w:proofErr w:type="spellEnd"/>
-      <w:r>
-        <w:rPr>
-          <w:lang w:val="es-ES"/>
-        </w:rPr>
-        <w:t xml:space="preserve">/ y </w:t>
-      </w:r>
-      <w:proofErr w:type="spellStart"/>
-      <w:r>
-        <w:rPr>
-          <w:lang w:val="es-ES"/>
-        </w:rPr>
-        <w:t>frontend</w:t>
-      </w:r>
-      <w:proofErr w:type="spellEnd"/>
-      <w:r>
-        <w:rPr>
-          <w:lang w:val="es-ES"/>
-        </w:rPr>
-        <w:t>/ hasta la integración de pagos con Stripe y la migración del sistema de diseño a SASS.</w:t>
+        <w:t xml:space="preserve">El repositorio acumula más de 40 commits que reflejan la evolución del proyecto, desde la reestructuración inicial en backend/ y frontend/ hasta la integración de pagos con Stripe y la migración del sistema de diseño a SASS.</w:t>
       </w:r>
     </w:p>
     <w:p>
@@ -13978,61 +12717,6 @@
         <w:rPr>
           <w:lang w:val="es-ES"/>
         </w:rPr>
-        <w:t xml:space="preserve">Pruebas unitarias: se han implementado con </w:t>
-      </w:r>
-      <w:proofErr w:type="spellStart"/>
-      <w:r>
-        <w:rPr>
-          <w:lang w:val="es-ES"/>
-        </w:rPr>
-        <w:t>JUnit</w:t>
-      </w:r>
-      <w:proofErr w:type="spellEnd"/>
-      <w:r>
-        <w:rPr>
-          <w:lang w:val="es-ES"/>
-        </w:rPr>
-        <w:t xml:space="preserve"> 5 y </w:t>
-      </w:r>
-      <w:proofErr w:type="spellStart"/>
-      <w:r>
-        <w:rPr>
-          <w:lang w:val="es-ES"/>
-        </w:rPr>
-        <w:t>Mockito</w:t>
-      </w:r>
-      <w:proofErr w:type="spellEnd"/>
-      <w:r>
-        <w:rPr>
-          <w:lang w:val="es-ES"/>
-        </w:rPr>
-        <w:t xml:space="preserve"> sobre la capa de servicio de cada microservicio, cubriendo los flujos de negocio principales (registro/</w:t>
-      </w:r>
-      <w:proofErr w:type="spellStart"/>
-      <w:r>
-        <w:rPr>
-          <w:lang w:val="es-ES"/>
-        </w:rPr>
-        <w:t>login</w:t>
-      </w:r>
-      <w:proofErr w:type="spellEnd"/>
-      <w:r>
-        <w:rPr>
-          <w:lang w:val="es-ES"/>
-        </w:rPr>
-        <w:t>, transferencia con saldo insuficiente, creación y cálculo de facturas y liquidaciones trimestrales).</w:t>
-      </w:r>
-    </w:p>
-    <w:p>
-      <w:pPr>
-        <w:rPr>
-          <w:lang w:val="es-ES"/>
-        </w:rPr>
-      </w:pPr>
-      <w:r>
-        <w:rPr>
-          <w:lang w:val="es-ES"/>
-        </w:rPr>
         <w:lastRenderedPageBreak/>
         <w:t xml:space="preserve">Pruebas de integración: con @SpringBootTest y </w:t>
       </w:r>
@@ -14188,21 +12872,7 @@
         <w:rPr>
           <w:lang w:val="es-ES"/>
         </w:rPr>
-        <w:t xml:space="preserve">Se ha validado la interfaz en los navegadores Chrome, Firefox y Safari, con pruebas de diseño responsive a 375px, 768px y 1440px. En materia de accesibilidad se han cuidado: el uso de HTML semántico y etiquetas asociadas a los campos de formulario, el contraste de color suficiente entre texto y fondo (verificado en los temas claro y oscuro), la navegación por teclado y los textos alternativos en los elementos no textuales. Como mejora futura se plantea una auditoría sistemática con herramientas como Lighthouse o </w:t>
-      </w:r>
-      <w:proofErr w:type="spellStart"/>
-      <w:r>
-        <w:rPr>
-          <w:lang w:val="es-ES"/>
-        </w:rPr>
-        <w:t>axe</w:t>
-      </w:r>
-      <w:proofErr w:type="spellEnd"/>
-      <w:r>
-        <w:rPr>
-          <w:lang w:val="es-ES"/>
-        </w:rPr>
-        <w:t xml:space="preserve"> para alcanzar el nivel AA de las WCAG 2.1.</w:t>
+        <w:t xml:space="preserve">La interfaz se ha validado en Chrome, Firefox y Safari, con diseño responsive a 375, 768 y 1440 px. En accesibilidad se ha cuidado el HTML semántico, las etiquetas asociadas a los formularios, el contraste de color (temas claro y oscuro), la navegación por teclado y los textos alternativos. Como mejora futura se plantea una auditoría con Lighthouse o axe para el nivel AA de las WCAG 2.1.</w:t>
       </w:r>
     </w:p>
     <w:p>
@@ -15451,75 +14121,11 @@
           <w:lang w:val="es-ES"/>
         </w:rPr>
       </w:pPr>
-      <w:proofErr w:type="spellStart"/>
-      <w:r>
-        <w:rPr>
-          <w:lang w:val="es-ES"/>
-        </w:rPr>
-        <w:t>PayFlow</w:t>
-      </w:r>
-      <w:proofErr w:type="spellEnd"/>
-      <w:r>
-        <w:rPr>
-          <w:lang w:val="es-ES"/>
-        </w:rPr>
-        <w:t xml:space="preserve"> ha alcanzado satisfactoriamente los objetivos planteados: una plataforma de finanzas personales completa y funcional, con una arquitectura de microservicios robusta y un </w:t>
-      </w:r>
-      <w:proofErr w:type="spellStart"/>
-      <w:r>
-        <w:rPr>
-          <w:lang w:val="es-ES"/>
-        </w:rPr>
-        <w:t>frontend</w:t>
-      </w:r>
-      <w:proofErr w:type="spellEnd"/>
-      <w:r>
-        <w:rPr>
-          <w:lang w:val="es-ES"/>
-        </w:rPr>
-        <w:t xml:space="preserve"> moderno, que integra funcionalidades poco habituales de forma conjunta (cartera P2P, Open </w:t>
-      </w:r>
-      <w:proofErr w:type="spellStart"/>
-      <w:r>
-        <w:rPr>
-          <w:lang w:val="es-ES"/>
-        </w:rPr>
-        <w:t>Banking</w:t>
-      </w:r>
-      <w:proofErr w:type="spellEnd"/>
-      <w:r>
-        <w:rPr>
-          <w:lang w:val="es-ES"/>
-        </w:rPr>
-        <w:t xml:space="preserve"> PSD2, módulo fiscal para autónomos y pagos con Stripe). La separación en servicios independientes con su propia base de datos, el </w:t>
-      </w:r>
-      <w:proofErr w:type="spellStart"/>
-      <w:r>
-        <w:rPr>
-          <w:lang w:val="es-ES"/>
-        </w:rPr>
-        <w:t>gateway</w:t>
-      </w:r>
-      <w:proofErr w:type="spellEnd"/>
-      <w:r>
-        <w:rPr>
-          <w:lang w:val="es-ES"/>
-        </w:rPr>
-        <w:t xml:space="preserve"> con seguridad centralizada y la orquestación con Docker </w:t>
-      </w:r>
-      <w:proofErr w:type="spellStart"/>
-      <w:r>
-        <w:rPr>
-          <w:lang w:val="es-ES"/>
-        </w:rPr>
-        <w:t>Compose</w:t>
-      </w:r>
-      <w:proofErr w:type="spellEnd"/>
-      <w:r>
-        <w:rPr>
-          <w:lang w:val="es-ES"/>
-        </w:rPr>
-        <w:t xml:space="preserve"> dan como resultado un sistema desacoplado, mantenible y reproducible.</w:t>
+      <w:r>
+        <w:rPr>
+          <w:lang w:val="es-ES"/>
+        </w:rPr>
+        <w:t xml:space="preserve">PayFlow ha alcanzado los objetivos planteados: una plataforma de finanzas personales completa y funcional, con una arquitectura de microservicios sólida y un frontend moderno, que integra de forma conjunta funcionalidades poco habituales (cartera P2P, Open Banking PSD2, módulo fiscal y pagos con Stripe). La separación en servicios con base de datos propia, el gateway con seguridad centralizada y la orquestación con Docker Compose dan como resultado un sistema desacoplado, mantenible y reproducible.</w:t>
       </w:r>
     </w:p>
     <w:p>
@@ -15548,91 +14154,7 @@
         <w:rPr>
           <w:lang w:val="es-ES"/>
         </w:rPr>
-        <w:t xml:space="preserve">El proyecto ha permitido consolidar, en un contexto realista, los conocimientos del ciclo: programación en Java con Spring Boot, desarrollo </w:t>
-      </w:r>
-      <w:proofErr w:type="spellStart"/>
-      <w:r>
-        <w:rPr>
-          <w:lang w:val="es-ES"/>
-        </w:rPr>
-        <w:t>frontend</w:t>
-      </w:r>
-      <w:proofErr w:type="spellEnd"/>
-      <w:r>
-        <w:rPr>
-          <w:lang w:val="es-ES"/>
-        </w:rPr>
-        <w:t xml:space="preserve"> con </w:t>
-      </w:r>
-      <w:proofErr w:type="spellStart"/>
-      <w:r>
-        <w:rPr>
-          <w:lang w:val="es-ES"/>
-        </w:rPr>
-        <w:t>React</w:t>
-      </w:r>
-      <w:proofErr w:type="spellEnd"/>
-      <w:r>
-        <w:rPr>
-          <w:lang w:val="es-ES"/>
-        </w:rPr>
-        <w:t xml:space="preserve">, diseño de bases de datos relacionales, seguridad con JWT y roles, contenedorización con Docker e integración con </w:t>
-      </w:r>
-      <w:proofErr w:type="spellStart"/>
-      <w:r>
-        <w:rPr>
-          <w:lang w:val="es-ES"/>
-        </w:rPr>
-        <w:t>APIs</w:t>
-      </w:r>
-      <w:proofErr w:type="spellEnd"/>
-      <w:r>
-        <w:rPr>
-          <w:lang w:val="es-ES"/>
-        </w:rPr>
-        <w:t xml:space="preserve"> REST externas (</w:t>
-      </w:r>
-      <w:proofErr w:type="spellStart"/>
-      <w:r>
-        <w:rPr>
-          <w:lang w:val="es-ES"/>
-        </w:rPr>
-        <w:t>Nordigen</w:t>
-      </w:r>
-      <w:proofErr w:type="spellEnd"/>
-      <w:r>
-        <w:rPr>
-          <w:lang w:val="es-ES"/>
-        </w:rPr>
-        <w:t xml:space="preserve"> y Stripe). Entre las principales dificultades superadas destacan la integración del flujo de consentimiento PSD2, la particularidad de los Payment Links de Stripe (que no propagan metadatos, lo que obligó a validar el pago mediante el JWT y la suscripción), la consistencia de datos en operaciones que cruzan varios servicios y las diferencias de SQL entre motores (por ejemplo, sustituir </w:t>
-      </w:r>
-      <w:proofErr w:type="gramStart"/>
-      <w:r>
-        <w:rPr>
-          <w:lang w:val="es-ES"/>
-        </w:rPr>
-        <w:t>YEAR(</w:t>
-      </w:r>
-      <w:proofErr w:type="gramEnd"/>
-      <w:r>
-        <w:rPr>
-          <w:lang w:val="es-ES"/>
-        </w:rPr>
-        <w:t xml:space="preserve">) por </w:t>
-      </w:r>
-      <w:proofErr w:type="gramStart"/>
-      <w:r>
-        <w:rPr>
-          <w:lang w:val="es-ES"/>
-        </w:rPr>
-        <w:t>EXTRACT(</w:t>
-      </w:r>
-      <w:proofErr w:type="gramEnd"/>
-      <w:r>
-        <w:rPr>
-          <w:lang w:val="es-ES"/>
-        </w:rPr>
-        <w:t>YEAR FROM fecha) en PostgreSQL).</w:t>
+        <w:t xml:space="preserve">El proyecto ha permitido consolidar en un contexto realista los conocimientos del ciclo: Java con Spring Boot, frontend con React, bases de datos relacionales, seguridad con JWT y roles, contenedorización con Docker e integración con APIs externas (Nordigen y Stripe). Las principales dificultades superadas fueron la integración del consentimiento PSD2, la particularidad de los Payment Links de Stripe (que no propagan metadatos, lo que obligó a validar el pago por el JWT y la suscripción), la consistencia de datos entre servicios y las diferencias de SQL entre motores.</w:t>
       </w:r>
     </w:p>
     <w:p>

</xml_diff>